<commit_message>
fix: publish clean onboarding esign contracts
</commit_message>
<xml_diff>
--- a/contracts/generated/Homix_Living_Solo_Agent_Affiliation_Agreement_v4.2-candidate.docx
+++ b/contracts/generated/Homix_Living_Solo_Agent_Affiliation_Agreement_v4.2-candidate.docx
@@ -171,7 +171,6 @@
                 <w:color w:val="1D1C19"/>
                 <w:sz w:val="16"/>
               </w:rPr>
-              <w:t>[agent_name]</w:t>
             </w:r>
           </w:p>
         </w:tc>
@@ -208,7 +207,6 @@
                 <w:color w:val="1D1C19"/>
                 <w:sz w:val="16"/>
               </w:rPr>
-              <w:t>[agent_id]</w:t>
             </w:r>
           </w:p>
         </w:tc>
@@ -247,7 +245,6 @@
                 <w:color w:val="1D1C19"/>
                 <w:sz w:val="16"/>
               </w:rPr>
-              <w:t>[agent_email]</w:t>
             </w:r>
           </w:p>
         </w:tc>
@@ -284,7 +281,6 @@
                 <w:color w:val="1D1C19"/>
                 <w:sz w:val="16"/>
               </w:rPr>
-              <w:t>[agent_phone]</w:t>
             </w:r>
           </w:p>
         </w:tc>
@@ -323,7 +319,6 @@
                 <w:color w:val="1D1C19"/>
                 <w:sz w:val="16"/>
               </w:rPr>
-              <w:t>[license_number]</w:t>
             </w:r>
           </w:p>
         </w:tc>
@@ -360,7 +355,6 @@
                 <w:color w:val="1D1C19"/>
                 <w:sz w:val="16"/>
               </w:rPr>
-              <w:t>[practice]</w:t>
             </w:r>
           </w:p>
         </w:tc>
@@ -399,7 +393,6 @@
                 <w:color w:val="1D1C19"/>
                 <w:sz w:val="16"/>
               </w:rPr>
-              <w:t>[compensation_plan]</w:t>
             </w:r>
           </w:p>
         </w:tc>
@@ -436,7 +429,6 @@
                 <w:color w:val="1D1C19"/>
                 <w:sz w:val="16"/>
               </w:rPr>
-              <w:t>[affiliation_term_months] months</w:t>
             </w:r>
           </w:p>
         </w:tc>
@@ -475,7 +467,6 @@
                 <w:color w:val="1D1C19"/>
                 <w:sz w:val="16"/>
               </w:rPr>
-              <w:t>[sponsor_name]</w:t>
             </w:r>
           </w:p>
         </w:tc>
@@ -512,7 +503,6 @@
                 <w:color w:val="1D1C19"/>
                 <w:sz w:val="16"/>
               </w:rPr>
-              <w:t>[team_name]</w:t>
             </w:r>
           </w:p>
         </w:tc>
@@ -686,7 +676,7 @@
           <w:color w:val="1D1C19"/>
           <w:sz w:val="18"/>
         </w:rPr>
-        <w:t>Selected compensation plan (read-only): [compensation_plan]</w:t>
+        <w:t xml:space="preserve">Selected compensation plan (read-only): </w:t>
       </w:r>
     </w:p>
     <w:tbl>
@@ -1584,7 +1574,6 @@
                 <w:color w:val="1D1C19"/>
                 <w:sz w:val="16"/>
               </w:rPr>
-              <w:t>[agent_name]</w:t>
             </w:r>
           </w:p>
         </w:tc>
@@ -1621,7 +1610,6 @@
                 <w:color w:val="1D1C19"/>
                 <w:sz w:val="16"/>
               </w:rPr>
-              <w:t>[agent_address]</w:t>
             </w:r>
           </w:p>
         </w:tc>
@@ -1660,7 +1648,6 @@
                 <w:color w:val="1D1C19"/>
                 <w:sz w:val="16"/>
               </w:rPr>
-              <w:t>[license_number]</w:t>
             </w:r>
           </w:p>
         </w:tc>
@@ -1697,7 +1684,6 @@
                 <w:color w:val="1D1C19"/>
                 <w:sz w:val="16"/>
               </w:rPr>
-              <w:t>[ica_effective_date]</w:t>
             </w:r>
           </w:p>
         </w:tc>

</xml_diff>